<commit_message>
docs: add Chapter 3 roles/evaluation/ethics sections (3.6-3.8) to 9.9.26 export
</commit_message>
<xml_diff>
--- a/IMRAWS-NLP-CAPSTONE-9.9.26.docx
+++ b/IMRAWS-NLP-CAPSTONE-9.9.26.docx
@@ -3568,6 +3568,132 @@
         </w:p>
         <w:p>
           <w:pPr>
+            <w:pStyle w:val="TOCHeading"/>
+            <w:spacing w:line="240" w:lineRule="auto"/>
+            <w:ind w:left="567" w:right="-406"/>
+            <w:rPr>
+              <w:rPr>
+                <w:rFonts w:ascii="Times New Roman" w:hAnsi="Times New Roman" w:cs="Times New Roman"/>
+                <w:color w:val="auto"/>
+                <w:sz w:val="24"/>
+                <w:szCs w:val="24"/>
+              </w:rPr>
+            </w:rPr>
+          </w:pPr>
+          <w:r>
+            <w:rPr>
+              <w:rFonts w:ascii="Times New Roman" w:hAnsi="Times New Roman" w:cs="Times New Roman"/>
+              <w:color w:val="auto"/>
+              <w:sz w:val="24"/>
+              <w:szCs w:val="24"/>
+            </w:rPr>
+            <w:t>3.6 Roles and Responsibilities</w:t>
+          </w:r>
+          <w:r>
+            <w:rPr>
+              <w:rFonts w:ascii="Times New Roman" w:hAnsi="Times New Roman" w:cs="Times New Roman"/>
+              <w:color w:val="auto"/>
+              <w:sz w:val="24"/>
+              <w:szCs w:val="24"/>
+            </w:rPr>
+            <w:ptab w:relativeTo="margin" w:alignment="right" w:leader="dot"/>
+          </w:r>
+          <w:r>
+            <w:rPr>
+              <w:rFonts w:ascii="Times New Roman" w:hAnsi="Times New Roman" w:cs="Times New Roman"/>
+              <w:color w:val="auto"/>
+              <w:sz w:val="24"/>
+              <w:szCs w:val="24"/>
+            </w:rPr>
+            <w:t>77</w:t>
+          </w:r>
+        </w:p>
+        <w:p>
+          <w:pPr>
+            <w:pStyle w:val="TOCHeading"/>
+            <w:spacing w:line="240" w:lineRule="auto"/>
+            <w:ind w:left="567" w:right="-406"/>
+            <w:rPr>
+              <w:rPr>
+                <w:rFonts w:ascii="Times New Roman" w:hAnsi="Times New Roman" w:cs="Times New Roman"/>
+                <w:color w:val="auto"/>
+                <w:sz w:val="24"/>
+                <w:szCs w:val="24"/>
+              </w:rPr>
+            </w:rPr>
+          </w:pPr>
+          <w:r>
+            <w:rPr>
+              <w:rFonts w:ascii="Times New Roman" w:hAnsi="Times New Roman" w:cs="Times New Roman"/>
+              <w:color w:val="auto"/>
+              <w:sz w:val="24"/>
+              <w:szCs w:val="24"/>
+            </w:rPr>
+            <w:t>3.7 Evaluation Procedure</w:t>
+          </w:r>
+          <w:r>
+            <w:rPr>
+              <w:rFonts w:ascii="Times New Roman" w:hAnsi="Times New Roman" w:cs="Times New Roman"/>
+              <w:color w:val="auto"/>
+              <w:sz w:val="24"/>
+              <w:szCs w:val="24"/>
+            </w:rPr>
+            <w:ptab w:relativeTo="margin" w:alignment="right" w:leader="dot"/>
+          </w:r>
+          <w:r>
+            <w:rPr>
+              <w:rFonts w:ascii="Times New Roman" w:hAnsi="Times New Roman" w:cs="Times New Roman"/>
+              <w:color w:val="auto"/>
+              <w:sz w:val="24"/>
+              <w:szCs w:val="24"/>
+            </w:rPr>
+            <w:t>78</w:t>
+          </w:r>
+        </w:p>
+        <w:p>
+          <w:pPr>
+            <w:pStyle w:val="TOCHeading"/>
+            <w:spacing w:line="240" w:lineRule="auto"/>
+            <w:ind w:left="567" w:right="-406"/>
+            <w:rPr>
+              <w:rPr>
+                <w:rFonts w:ascii="Times New Roman" w:hAnsi="Times New Roman" w:cs="Times New Roman"/>
+                <w:color w:val="auto"/>
+                <w:sz w:val="24"/>
+                <w:szCs w:val="24"/>
+              </w:rPr>
+            </w:rPr>
+          </w:pPr>
+          <w:r>
+            <w:rPr>
+              <w:rFonts w:ascii="Times New Roman" w:hAnsi="Times New Roman" w:cs="Times New Roman"/>
+              <w:color w:val="auto"/>
+              <w:sz w:val="24"/>
+              <w:szCs w:val="24"/>
+            </w:rPr>
+            <w:t>3.8 Ethical Standards and Considerations</w:t>
+          </w:r>
+          <w:r>
+            <w:rPr>
+              <w:rFonts w:ascii="Times New Roman" w:hAnsi="Times New Roman" w:cs="Times New Roman"/>
+              <w:color w:val="auto"/>
+              <w:sz w:val="24"/>
+              <w:szCs w:val="24"/>
+            </w:rPr>
+            <w:ptab w:relativeTo="margin" w:alignment="right" w:leader="dot"/>
+          </w:r>
+          <w:r>
+            <w:rPr>
+              <w:rFonts w:ascii="Times New Roman" w:hAnsi="Times New Roman" w:cs="Times New Roman"/>
+              <w:color w:val="auto"/>
+              <w:sz w:val="24"/>
+              <w:szCs w:val="24"/>
+            </w:rPr>
+            <w:t>80</w:t>
+          </w:r>
+        </w:p>
+        <w:p>
+          <w:pPr>
             <w:ind w:left="567" w:right="-406"/>
             <w:rPr>
               <w:lang w:val="en-US"/>
@@ -21642,6 +21768,941 @@
           <w:szCs w:val="24"/>
         </w:rPr>
         <w:t xml:space="preserve"> The computed weighted mean for each item will be mapped to the Likert scale interpretation table above. The evaluation will be considered successful if the overall weighted mean across all criteria falls within the "Agree" range (3.41 - 4.20) or higher, indicating that the prototype meets the functional and non-functional requirements defined for the Incident Management and Routing App and Web System</w:t>
+      </w:r>
+    </w:p>
+    <w:p>
+      <w:pPr>
+        <w:spacing w:before="146" w:line="496" w:lineRule="auto"/>
+        <w:ind w:left="284" w:right="283"/>
+        <w:jc w:val="both"/>
+        <w:rPr>
+          <w:rPr>
+            <w:rFonts w:ascii="Times New Roman" w:hAnsi="Times New Roman" w:cs="Times New Roman"/>
+            <w:b/>
+            <w:bCs/>
+            <w:sz w:val="24"/>
+            <w:szCs w:val="24"/>
+          </w:rPr>
+        </w:rPr>
+      </w:pPr>
+      <w:r>
+        <w:rPr>
+          <w:rFonts w:ascii="Times New Roman" w:hAnsi="Times New Roman" w:cs="Times New Roman"/>
+          <w:b/>
+          <w:bCs/>
+          <w:sz w:val="24"/>
+          <w:szCs w:val="24"/>
+        </w:rPr>
+        <w:t>3.6</w:t>
+      </w:r>
+      <w:r>
+        <w:rPr>
+          <w:rFonts w:ascii="Times New Roman" w:hAnsi="Times New Roman" w:cs="Times New Roman"/>
+          <w:b/>
+          <w:bCs/>
+          <w:sz w:val="24"/>
+          <w:szCs w:val="24"/>
+        </w:rPr>
+        <w:tab/>
+        <w:t xml:space="preserve">Roles and Responsibilities </w:t>
+      </w:r>
+    </w:p>
+    <w:p>
+      <w:pPr>
+        <w:spacing w:before="146" w:line="480" w:lineRule="auto"/>
+        <w:ind w:left="284" w:right="283" w:firstLine="360"/>
+        <w:jc w:val="both"/>
+        <w:rPr>
+          <w:rPr>
+            <w:rFonts w:ascii="Times New Roman" w:hAnsi="Times New Roman" w:cs="Times New Roman"/>
+            <w:sz w:val="24"/>
+            <w:szCs w:val="24"/>
+          </w:rPr>
+        </w:rPr>
+      </w:pPr>
+      <w:r>
+        <w:rPr>
+          <w:rFonts w:ascii="Times New Roman" w:hAnsi="Times New Roman" w:cs="Times New Roman"/>
+          <w:sz w:val="24"/>
+          <w:szCs w:val="24"/>
+        </w:rPr>
+        <w:t>Roles and responsibilities define the functional structure of the research team throughout the system development life cycle (SDLC). For IMRAWS-NLP, each role was assigned to one or more of the researchers, and its core deliverables and duties were carried out across the phases of the Agile methodology described in Section 3.1. The roles established for the project, together with their primary tasks, are presented below.</w:t>
+      </w:r>
+    </w:p>
+    <w:p>
+      <w:pPr>
+        <w:spacing w:before="146" w:line="480" w:lineRule="auto"/>
+        <w:ind w:left="284" w:right="283" w:firstLine="360"/>
+        <w:jc w:val="both"/>
+        <w:rPr>
+          <w:rPr>
+            <w:rFonts w:ascii="Times New Roman" w:hAnsi="Times New Roman" w:cs="Times New Roman"/>
+            <w:sz w:val="24"/>
+            <w:szCs w:val="24"/>
+          </w:rPr>
+        </w:rPr>
+      </w:pPr>
+      <w:r>
+        <w:rPr>
+          <w:rFonts w:ascii="Times New Roman" w:hAnsi="Times New Roman" w:cs="Times New Roman"/>
+          <w:b/>
+          <w:bCs/>
+          <w:sz w:val="24"/>
+          <w:szCs w:val="24"/>
+        </w:rPr>
+        <w:t>Project Manager. </w:t>
+      </w:r>
+      <w:r>
+        <w:rPr>
+          <w:rFonts w:ascii="Times New Roman" w:hAnsi="Times New Roman" w:cs="Times New Roman"/>
+          <w:sz w:val="24"/>
+          <w:szCs w:val="24"/>
+        </w:rPr>
+        <w:t xml:space="preserve">Oversees the overall project timeline and milestone delivery; coordinates the members of the research team, the capstone adviser, and the water service provider; prepares progress reports; and ensures that each Agile sprint produces the required deliverables.</w:t>
+      </w:r>
+    </w:p>
+    <w:p>
+      <w:pPr>
+        <w:spacing w:before="146" w:line="480" w:lineRule="auto"/>
+        <w:ind w:left="284" w:right="283" w:firstLine="360"/>
+        <w:jc w:val="both"/>
+        <w:rPr>
+          <w:rPr>
+            <w:rFonts w:ascii="Times New Roman" w:hAnsi="Times New Roman" w:cs="Times New Roman"/>
+            <w:sz w:val="24"/>
+            <w:szCs w:val="24"/>
+          </w:rPr>
+        </w:rPr>
+      </w:pPr>
+      <w:r>
+        <w:rPr>
+          <w:rFonts w:ascii="Times New Roman" w:hAnsi="Times New Roman" w:cs="Times New Roman"/>
+          <w:b/>
+          <w:bCs/>
+          <w:sz w:val="24"/>
+          <w:szCs w:val="24"/>
+        </w:rPr>
+        <w:t>Systems Analyst. </w:t>
+      </w:r>
+      <w:r>
+        <w:rPr>
+          <w:rFonts w:ascii="Times New Roman" w:hAnsi="Times New Roman" w:cs="Times New Roman"/>
+          <w:sz w:val="24"/>
+          <w:szCs w:val="24"/>
+        </w:rPr>
+        <w:t xml:space="preserve">Conducts the interviews, questionnaires, and process walkthrough described in Section 3.3; translates the gathered requirements into system specifications, data flow diagrams, and use cases; and maintains the consistency between the documented requirements and the implemented system.</w:t>
+      </w:r>
+    </w:p>
+    <w:p>
+      <w:pPr>
+        <w:spacing w:before="146" w:line="480" w:lineRule="auto"/>
+        <w:ind w:left="284" w:right="283" w:firstLine="360"/>
+        <w:jc w:val="both"/>
+        <w:rPr>
+          <w:rPr>
+            <w:rFonts w:ascii="Times New Roman" w:hAnsi="Times New Roman" w:cs="Times New Roman"/>
+            <w:sz w:val="24"/>
+            <w:szCs w:val="24"/>
+          </w:rPr>
+        </w:rPr>
+      </w:pPr>
+      <w:r>
+        <w:rPr>
+          <w:rFonts w:ascii="Times New Roman" w:hAnsi="Times New Roman" w:cs="Times New Roman"/>
+          <w:b/>
+          <w:bCs/>
+          <w:sz w:val="24"/>
+          <w:szCs w:val="24"/>
+        </w:rPr>
+        <w:t>Database Designer. </w:t>
+      </w:r>
+      <w:r>
+        <w:rPr>
+          <w:rFonts w:ascii="Times New Roman" w:hAnsi="Times New Roman" w:cs="Times New Roman"/>
+          <w:sz w:val="24"/>
+          <w:szCs w:val="24"/>
+        </w:rPr>
+        <w:t xml:space="preserve">Designs and administers the PostgreSQL database, including the eight core tables and their relationships, primary and foreign keys, constraints, and role-related fields; executes database migrations; and performs data integrity and consistency tests.</w:t>
+      </w:r>
+    </w:p>
+    <w:p>
+      <w:pPr>
+        <w:spacing w:before="146" w:line="480" w:lineRule="auto"/>
+        <w:ind w:left="284" w:right="283" w:firstLine="360"/>
+        <w:jc w:val="both"/>
+        <w:rPr>
+          <w:rPr>
+            <w:rFonts w:ascii="Times New Roman" w:hAnsi="Times New Roman" w:cs="Times New Roman"/>
+            <w:sz w:val="24"/>
+            <w:szCs w:val="24"/>
+          </w:rPr>
+        </w:rPr>
+      </w:pPr>
+      <w:r>
+        <w:rPr>
+          <w:rFonts w:ascii="Times New Roman" w:hAnsi="Times New Roman" w:cs="Times New Roman"/>
+          <w:b/>
+          <w:bCs/>
+          <w:sz w:val="24"/>
+          <w:szCs w:val="24"/>
+        </w:rPr>
+        <w:t>Backend Developer (Laravel). </w:t>
+      </w:r>
+      <w:r>
+        <w:rPr>
+          <w:rFonts w:ascii="Times New Roman" w:hAnsi="Times New Roman" w:cs="Times New Roman"/>
+          <w:sz w:val="24"/>
+          <w:szCs w:val="24"/>
+        </w:rPr>
+        <w:t xml:space="preserve">Develops the application programming interface (API) and the business logic of the system, including JWT-based authentication, role-based access control (RBAC) middleware, the incident lifecycle, AI-driven assignment, human-in-the-loop adjudication, notifications, and report analytics endpoints.</w:t>
+      </w:r>
+    </w:p>
+    <w:p>
+      <w:pPr>
+        <w:spacing w:before="146" w:line="480" w:lineRule="auto"/>
+        <w:ind w:left="284" w:right="283" w:firstLine="360"/>
+        <w:jc w:val="both"/>
+        <w:rPr>
+          <w:rPr>
+            <w:rFonts w:ascii="Times New Roman" w:hAnsi="Times New Roman" w:cs="Times New Roman"/>
+            <w:sz w:val="24"/>
+            <w:szCs w:val="24"/>
+          </w:rPr>
+        </w:rPr>
+      </w:pPr>
+      <w:r>
+        <w:rPr>
+          <w:rFonts w:ascii="Times New Roman" w:hAnsi="Times New Roman" w:cs="Times New Roman"/>
+          <w:b/>
+          <w:bCs/>
+          <w:sz w:val="24"/>
+          <w:szCs w:val="24"/>
+        </w:rPr>
+        <w:t>Mobile Developer (Flutter). </w:t>
+      </w:r>
+      <w:r>
+        <w:rPr>
+          <w:rFonts w:ascii="Times New Roman" w:hAnsi="Times New Roman" w:cs="Times New Roman"/>
+          <w:sz w:val="24"/>
+          <w:szCs w:val="24"/>
+        </w:rPr>
+        <w:t xml:space="preserve">Builds the Android mobile application for the Customer and Offsite Staff, covering registration and login, complaint submission, status tracking, notification viewing, the availability toggle, the incident queue, resolution notes, and photo proof attachments.</w:t>
+      </w:r>
+    </w:p>
+    <w:p>
+      <w:pPr>
+        <w:spacing w:before="146" w:line="480" w:lineRule="auto"/>
+        <w:ind w:left="284" w:right="283" w:firstLine="360"/>
+        <w:jc w:val="both"/>
+        <w:rPr>
+          <w:rPr>
+            <w:rFonts w:ascii="Times New Roman" w:hAnsi="Times New Roman" w:cs="Times New Roman"/>
+            <w:sz w:val="24"/>
+            <w:szCs w:val="24"/>
+          </w:rPr>
+        </w:rPr>
+      </w:pPr>
+      <w:r>
+        <w:rPr>
+          <w:rFonts w:ascii="Times New Roman" w:hAnsi="Times New Roman" w:cs="Times New Roman"/>
+          <w:b/>
+          <w:bCs/>
+          <w:sz w:val="24"/>
+          <w:szCs w:val="24"/>
+        </w:rPr>
+        <w:t>Web Portal Developer. </w:t>
+      </w:r>
+      <w:r>
+        <w:rPr>
+          <w:rFonts w:ascii="Times New Roman" w:hAnsi="Times New Roman" w:cs="Times New Roman"/>
+          <w:sz w:val="24"/>
+          <w:szCs w:val="24"/>
+        </w:rPr>
+        <w:t xml:space="preserve">Builds the Administrator and Engineer web portal, including the report dashboards, user account management, the incident queue, the flagged incident adjudication panel, the routing configuration view, and the report interfaces.</w:t>
+      </w:r>
+    </w:p>
+    <w:p>
+      <w:pPr>
+        <w:spacing w:before="146" w:line="480" w:lineRule="auto"/>
+        <w:ind w:left="284" w:right="283" w:firstLine="360"/>
+        <w:jc w:val="both"/>
+        <w:rPr>
+          <w:rPr>
+            <w:rFonts w:ascii="Times New Roman" w:hAnsi="Times New Roman" w:cs="Times New Roman"/>
+            <w:sz w:val="24"/>
+            <w:szCs w:val="24"/>
+          </w:rPr>
+        </w:rPr>
+      </w:pPr>
+      <w:r>
+        <w:rPr>
+          <w:rFonts w:ascii="Times New Roman" w:hAnsi="Times New Roman" w:cs="Times New Roman"/>
+          <w:b/>
+          <w:bCs/>
+          <w:sz w:val="24"/>
+          <w:szCs w:val="24"/>
+        </w:rPr>
+        <w:t>AI and NLP Developer (Python). </w:t>
+      </w:r>
+      <w:r>
+        <w:rPr>
+          <w:rFonts w:ascii="Times New Roman" w:hAnsi="Times New Roman" w:cs="Times New Roman"/>
+          <w:sz w:val="24"/>
+          <w:szCs w:val="24"/>
+        </w:rPr>
+        <w:t xml:space="preserve">Implements the text pre-processing, the NLP classification of complaints into the Billing, Water Quality, Metering, and Operations categories, the sentiment analysis module, and the composite severity scoring; exposes the service through the FastAPI microservice; and supports the retraining of the model from human-in-the-loop feedback records.</w:t>
+      </w:r>
+    </w:p>
+    <w:p>
+      <w:pPr>
+        <w:spacing w:before="146" w:line="480" w:lineRule="auto"/>
+        <w:ind w:left="284" w:right="283" w:firstLine="360"/>
+        <w:jc w:val="both"/>
+        <w:rPr>
+          <w:rPr>
+            <w:rFonts w:ascii="Times New Roman" w:hAnsi="Times New Roman" w:cs="Times New Roman"/>
+            <w:sz w:val="24"/>
+            <w:szCs w:val="24"/>
+          </w:rPr>
+        </w:rPr>
+      </w:pPr>
+      <w:r>
+        <w:rPr>
+          <w:rFonts w:ascii="Times New Roman" w:hAnsi="Times New Roman" w:cs="Times New Roman"/>
+          <w:b/>
+          <w:bCs/>
+          <w:sz w:val="24"/>
+          <w:szCs w:val="24"/>
+        </w:rPr>
+        <w:t>Quality Assurance Tester. </w:t>
+      </w:r>
+      <w:r>
+        <w:rPr>
+          <w:rFonts w:ascii="Times New Roman" w:hAnsi="Times New Roman" w:cs="Times New Roman"/>
+          <w:sz w:val="24"/>
+          <w:szCs w:val="24"/>
+        </w:rPr>
+        <w:t xml:space="preserve">Validates each sprint deliverable against its acceptance criteria; performs functional testing across the four user roles; verifies the enforcement of RBAC restrictions; tracks and documents defects; and prepares the test scenarios used during the evaluation demonstration.</w:t>
+      </w:r>
+    </w:p>
+    <w:p>
+      <w:pPr>
+        <w:spacing w:before="146" w:line="480" w:lineRule="auto"/>
+        <w:ind w:left="284" w:right="283" w:firstLine="360"/>
+        <w:jc w:val="both"/>
+        <w:rPr>
+          <w:rPr>
+            <w:rFonts w:ascii="Times New Roman" w:hAnsi="Times New Roman" w:cs="Times New Roman"/>
+            <w:sz w:val="24"/>
+            <w:szCs w:val="24"/>
+          </w:rPr>
+        </w:rPr>
+      </w:pPr>
+      <w:r>
+        <w:rPr>
+          <w:rFonts w:ascii="Times New Roman" w:hAnsi="Times New Roman" w:cs="Times New Roman"/>
+          <w:b/>
+          <w:bCs/>
+          <w:sz w:val="24"/>
+          <w:szCs w:val="24"/>
+        </w:rPr>
+        <w:t>Statistical Analyst. </w:t>
+      </w:r>
+      <w:r>
+        <w:rPr>
+          <w:rFonts w:ascii="Times New Roman" w:hAnsi="Times New Roman" w:cs="Times New Roman"/>
+          <w:sz w:val="24"/>
+          <w:szCs w:val="24"/>
+        </w:rPr>
+        <w:t xml:space="preserve">Prepares the Project Evaluation Tool based on the ISO/IEC 25010 software quality model; administers the evaluation questionnaire to the panelists; computes the weighted mean of the responses; and interprets the results using the Likert scale interpretation table.</w:t>
+      </w:r>
+    </w:p>
+    <w:p>
+      <w:pPr>
+        <w:spacing w:before="146" w:line="480" w:lineRule="auto"/>
+        <w:ind w:left="284" w:right="283" w:firstLine="360"/>
+        <w:jc w:val="both"/>
+        <w:rPr>
+          <w:rPr>
+            <w:rFonts w:ascii="Times New Roman" w:hAnsi="Times New Roman" w:cs="Times New Roman"/>
+            <w:sz w:val="24"/>
+            <w:szCs w:val="24"/>
+          </w:rPr>
+        </w:rPr>
+      </w:pPr>
+      <w:r>
+        <w:rPr>
+          <w:rFonts w:ascii="Times New Roman" w:hAnsi="Times New Roman" w:cs="Times New Roman"/>
+          <w:b/>
+          <w:bCs/>
+          <w:sz w:val="24"/>
+          <w:szCs w:val="24"/>
+        </w:rPr>
+        <w:t>Capstone Adviser. </w:t>
+      </w:r>
+      <w:r>
+        <w:rPr>
+          <w:rFonts w:ascii="Times New Roman" w:hAnsi="Times New Roman" w:cs="Times New Roman"/>
+          <w:sz w:val="24"/>
+          <w:szCs w:val="24"/>
+        </w:rPr>
+        <w:t xml:space="preserve">Provides guidance, technical review, and approval of the system design and documentation; monitors the progress of the researchers in each phase; and evaluates the completeness and quality of every deliverable.</w:t>
+      </w:r>
+    </w:p>
+    <w:p>
+      <w:pPr>
+        <w:spacing w:before="146" w:line="496" w:lineRule="auto"/>
+        <w:ind w:left="284" w:right="283"/>
+        <w:jc w:val="both"/>
+        <w:rPr>
+          <w:rPr>
+            <w:rFonts w:ascii="Times New Roman" w:hAnsi="Times New Roman" w:cs="Times New Roman"/>
+            <w:b/>
+            <w:bCs/>
+            <w:sz w:val="24"/>
+            <w:szCs w:val="24"/>
+          </w:rPr>
+        </w:rPr>
+      </w:pPr>
+      <w:r>
+        <w:rPr>
+          <w:rFonts w:ascii="Times New Roman" w:hAnsi="Times New Roman" w:cs="Times New Roman"/>
+          <w:b/>
+          <w:bCs/>
+          <w:sz w:val="24"/>
+          <w:szCs w:val="24"/>
+        </w:rPr>
+        <w:t>3.7</w:t>
+      </w:r>
+      <w:r>
+        <w:rPr>
+          <w:rFonts w:ascii="Times New Roman" w:hAnsi="Times New Roman" w:cs="Times New Roman"/>
+          <w:b/>
+          <w:bCs/>
+          <w:sz w:val="24"/>
+          <w:szCs w:val="24"/>
+        </w:rPr>
+        <w:tab/>
+        <w:t xml:space="preserve">Evaluation Procedure </w:t>
+      </w:r>
+    </w:p>
+    <w:p>
+      <w:pPr>
+        <w:spacing w:before="146" w:line="480" w:lineRule="auto"/>
+        <w:ind w:left="284" w:right="283" w:firstLine="360"/>
+        <w:jc w:val="both"/>
+        <w:rPr>
+          <w:rPr>
+            <w:rFonts w:ascii="Times New Roman" w:hAnsi="Times New Roman" w:cs="Times New Roman"/>
+            <w:sz w:val="24"/>
+            <w:szCs w:val="24"/>
+          </w:rPr>
+        </w:rPr>
+      </w:pPr>
+      <w:r>
+        <w:rPr>
+          <w:rFonts w:ascii="Times New Roman" w:hAnsi="Times New Roman" w:cs="Times New Roman"/>
+          <w:sz w:val="24"/>
+          <w:szCs w:val="24"/>
+        </w:rPr>
+        <w:t>The evaluation procedure describes the structured protocol followed by the researchers to test, validate, and evaluate IMRAWS-NLP. It specifies the sequence of activities, the instruments used, the target participants, and the manner in which the results are scored and interpreted. The evaluation was carried out through the following steps.</w:t>
+      </w:r>
+    </w:p>
+    <w:p>
+      <w:pPr>
+        <w:spacing w:before="146" w:line="480" w:lineRule="auto"/>
+        <w:ind w:left="284" w:right="283" w:firstLine="360"/>
+        <w:jc w:val="both"/>
+        <w:rPr>
+          <w:rPr>
+            <w:rFonts w:ascii="Times New Roman" w:hAnsi="Times New Roman" w:cs="Times New Roman"/>
+            <w:sz w:val="24"/>
+            <w:szCs w:val="24"/>
+          </w:rPr>
+        </w:rPr>
+      </w:pPr>
+      <w:r>
+        <w:rPr>
+          <w:rFonts w:ascii="Times New Roman" w:hAnsi="Times New Roman" w:cs="Times New Roman"/>
+          <w:b/>
+          <w:bCs/>
+          <w:sz w:val="24"/>
+          <w:szCs w:val="24"/>
+        </w:rPr>
+        <w:t>Step 1. Preparation of the Prototype and Evaluation Materials. </w:t>
+      </w:r>
+      <w:r>
+        <w:rPr>
+          <w:rFonts w:ascii="Times New Roman" w:hAnsi="Times New Roman" w:cs="Times New Roman"/>
+          <w:sz w:val="24"/>
+          <w:szCs w:val="24"/>
+        </w:rPr>
+        <w:t xml:space="preserve">The researchers prepared the runnable system prototype, including the Flutter mobile application, the Laravel web portal, and the FastAPI NLP microservice, together with a demonstration script that covers the complete workflow of each user role. The Project Evaluation Tool, a structured questionnaire based on the ISO/IEC 25010 software quality model, was likewise finalized.</w:t>
+      </w:r>
+    </w:p>
+    <w:p>
+      <w:pPr>
+        <w:spacing w:before="146" w:line="480" w:lineRule="auto"/>
+        <w:ind w:left="284" w:right="283" w:firstLine="360"/>
+        <w:jc w:val="both"/>
+        <w:rPr>
+          <w:rPr>
+            <w:rFonts w:ascii="Times New Roman" w:hAnsi="Times New Roman" w:cs="Times New Roman"/>
+            <w:sz w:val="24"/>
+            <w:szCs w:val="24"/>
+          </w:rPr>
+        </w:rPr>
+      </w:pPr>
+      <w:r>
+        <w:rPr>
+          <w:rFonts w:ascii="Times New Roman" w:hAnsi="Times New Roman" w:cs="Times New Roman"/>
+          <w:b/>
+          <w:bCs/>
+          <w:sz w:val="24"/>
+          <w:szCs w:val="24"/>
+        </w:rPr>
+        <w:t>Step 2. Orientation of the Evaluators. </w:t>
+      </w:r>
+      <w:r>
+        <w:rPr>
+          <w:rFonts w:ascii="Times New Roman" w:hAnsi="Times New Roman" w:cs="Times New Roman"/>
+          <w:sz w:val="24"/>
+          <w:szCs w:val="24"/>
+        </w:rPr>
+        <w:t xml:space="preserve">The three (3) faculty panelists from the College of Computer Studies were oriented on the objectives of the study, the features of the system, and the instructions for accomplishing the evaluation instrument.</w:t>
+      </w:r>
+    </w:p>
+    <w:p>
+      <w:pPr>
+        <w:spacing w:before="146" w:line="480" w:lineRule="auto"/>
+        <w:ind w:left="284" w:right="283" w:firstLine="360"/>
+        <w:jc w:val="both"/>
+        <w:rPr>
+          <w:rPr>
+            <w:rFonts w:ascii="Times New Roman" w:hAnsi="Times New Roman" w:cs="Times New Roman"/>
+            <w:sz w:val="24"/>
+            <w:szCs w:val="24"/>
+          </w:rPr>
+        </w:rPr>
+      </w:pPr>
+      <w:r>
+        <w:rPr>
+          <w:rFonts w:ascii="Times New Roman" w:hAnsi="Times New Roman" w:cs="Times New Roman"/>
+          <w:b/>
+          <w:bCs/>
+          <w:sz w:val="24"/>
+          <w:szCs w:val="24"/>
+        </w:rPr>
+        <w:t>Step 3. System Demonstration and Walkthrough. </w:t>
+      </w:r>
+      <w:r>
+        <w:rPr>
+          <w:rFonts w:ascii="Times New Roman" w:hAnsi="Times New Roman" w:cs="Times New Roman"/>
+          <w:sz w:val="24"/>
+          <w:szCs w:val="24"/>
+        </w:rPr>
+        <w:t xml:space="preserve">Each functional area was demonstrated end-to-end, from customer registration and complaint submission through NLP classification and severity assignment, AI-driven routing to the available team leader, accept, reject, or correct actions of the team leader, engineer adjudication, resolution with notes and photo proof, customer notification, and report generation with CSV export.</w:t>
+      </w:r>
+    </w:p>
+    <w:p>
+      <w:pPr>
+        <w:spacing w:before="146" w:line="480" w:lineRule="auto"/>
+        <w:ind w:left="284" w:right="283" w:firstLine="360"/>
+        <w:jc w:val="both"/>
+        <w:rPr>
+          <w:rPr>
+            <w:rFonts w:ascii="Times New Roman" w:hAnsi="Times New Roman" w:cs="Times New Roman"/>
+            <w:sz w:val="24"/>
+            <w:szCs w:val="24"/>
+          </w:rPr>
+        </w:rPr>
+      </w:pPr>
+      <w:r>
+        <w:rPr>
+          <w:rFonts w:ascii="Times New Roman" w:hAnsi="Times New Roman" w:cs="Times New Roman"/>
+          <w:b/>
+          <w:bCs/>
+          <w:sz w:val="24"/>
+          <w:szCs w:val="24"/>
+        </w:rPr>
+        <w:t>Step 4. Hands-On Evaluation. </w:t>
+      </w:r>
+      <w:r>
+        <w:rPr>
+          <w:rFonts w:ascii="Times New Roman" w:hAnsi="Times New Roman" w:cs="Times New Roman"/>
+          <w:sz w:val="24"/>
+          <w:szCs w:val="24"/>
+        </w:rPr>
+        <w:t xml:space="preserve">The panelists interacted with the prototype according to their respective areas of expertise and assessed the system against the criteria of functional suitability, performance efficiency, usability, reliability, and security.</w:t>
+      </w:r>
+    </w:p>
+    <w:p>
+      <w:pPr>
+        <w:spacing w:before="146" w:line="480" w:lineRule="auto"/>
+        <w:ind w:left="284" w:right="283" w:firstLine="360"/>
+        <w:jc w:val="both"/>
+        <w:rPr>
+          <w:rPr>
+            <w:rFonts w:ascii="Times New Roman" w:hAnsi="Times New Roman" w:cs="Times New Roman"/>
+            <w:sz w:val="24"/>
+            <w:szCs w:val="24"/>
+          </w:rPr>
+        </w:rPr>
+      </w:pPr>
+      <w:r>
+        <w:rPr>
+          <w:rFonts w:ascii="Times New Roman" w:hAnsi="Times New Roman" w:cs="Times New Roman"/>
+          <w:b/>
+          <w:bCs/>
+          <w:sz w:val="24"/>
+          <w:szCs w:val="24"/>
+        </w:rPr>
+        <w:t>Step 5. Administration of the Questionnaire. </w:t>
+      </w:r>
+      <w:r>
+        <w:rPr>
+          <w:rFonts w:ascii="Times New Roman" w:hAnsi="Times New Roman" w:cs="Times New Roman"/>
+          <w:sz w:val="24"/>
+          <w:szCs w:val="24"/>
+        </w:rPr>
+        <w:t xml:space="preserve">The Project Evaluation Tool was distributed to the panelists immediately after the demonstration and hands-on session. Each panelist rated every statement using the five-point Likert scale, and the accomplished responses were collected and encoded.</w:t>
+      </w:r>
+    </w:p>
+    <w:p>
+      <w:pPr>
+        <w:spacing w:before="146" w:line="480" w:lineRule="auto"/>
+        <w:ind w:left="284" w:right="283" w:firstLine="360"/>
+        <w:jc w:val="both"/>
+        <w:rPr>
+          <w:rPr>
+            <w:rFonts w:ascii="Times New Roman" w:hAnsi="Times New Roman" w:cs="Times New Roman"/>
+            <w:sz w:val="24"/>
+            <w:szCs w:val="24"/>
+          </w:rPr>
+        </w:rPr>
+      </w:pPr>
+      <w:r>
+        <w:rPr>
+          <w:rFonts w:ascii="Times New Roman" w:hAnsi="Times New Roman" w:cs="Times New Roman"/>
+          <w:b/>
+          <w:bCs/>
+          <w:sz w:val="24"/>
+          <w:szCs w:val="24"/>
+        </w:rPr>
+        <w:t>Step 6. Scoring and Analysis. </w:t>
+      </w:r>
+      <w:r>
+        <w:rPr>
+          <w:rFonts w:ascii="Times New Roman" w:hAnsi="Times New Roman" w:cs="Times New Roman"/>
+          <w:sz w:val="24"/>
+          <w:szCs w:val="24"/>
+        </w:rPr>
+        <w:t xml:space="preserve">The weighted mean of each statement and of each criterion was computed using the weighted mean formula presented in Section 3.5, where f is the frequency of responses for each scale point, w is the weight assigned to the scale point, and n is the total number of respondents. The computed values were then mapped to the Likert scale interpretation table.</w:t>
+      </w:r>
+    </w:p>
+    <w:p>
+      <w:pPr>
+        <w:spacing w:before="146" w:line="480" w:lineRule="auto"/>
+        <w:ind w:left="284" w:right="283" w:firstLine="360"/>
+        <w:jc w:val="both"/>
+        <w:rPr>
+          <w:rPr>
+            <w:rFonts w:ascii="Times New Roman" w:hAnsi="Times New Roman" w:cs="Times New Roman"/>
+            <w:sz w:val="24"/>
+            <w:szCs w:val="24"/>
+          </w:rPr>
+        </w:rPr>
+      </w:pPr>
+      <w:r>
+        <w:rPr>
+          <w:rFonts w:ascii="Times New Roman" w:hAnsi="Times New Roman" w:cs="Times New Roman"/>
+          <w:b/>
+          <w:bCs/>
+          <w:sz w:val="24"/>
+          <w:szCs w:val="24"/>
+        </w:rPr>
+        <w:t>Step 7. Interpretation and Reporting of Results. </w:t>
+      </w:r>
+      <w:r>
+        <w:rPr>
+          <w:rFonts w:ascii="Times New Roman" w:hAnsi="Times New Roman" w:cs="Times New Roman"/>
+          <w:sz w:val="24"/>
+          <w:szCs w:val="24"/>
+        </w:rPr>
+        <w:t xml:space="preserve">The evaluation was considered successful if the overall weighted mean fell within the Agree range (3.41 to 4.20) or higher. The consolidated results were presented to the evaluators and the capstone adviser, together with the comments and recommendations for further improvement.</w:t>
+      </w:r>
+    </w:p>
+    <w:p>
+      <w:pPr>
+        <w:spacing w:before="146" w:line="496" w:lineRule="auto"/>
+        <w:ind w:left="284" w:right="283"/>
+        <w:jc w:val="both"/>
+        <w:rPr>
+          <w:rPr>
+            <w:rFonts w:ascii="Times New Roman" w:hAnsi="Times New Roman" w:cs="Times New Roman"/>
+            <w:b/>
+            <w:bCs/>
+            <w:sz w:val="24"/>
+            <w:szCs w:val="24"/>
+          </w:rPr>
+        </w:rPr>
+      </w:pPr>
+      <w:r>
+        <w:rPr>
+          <w:rFonts w:ascii="Times New Roman" w:hAnsi="Times New Roman" w:cs="Times New Roman"/>
+          <w:b/>
+          <w:bCs/>
+          <w:sz w:val="24"/>
+          <w:szCs w:val="24"/>
+        </w:rPr>
+        <w:t>3.8</w:t>
+      </w:r>
+      <w:r>
+        <w:rPr>
+          <w:rFonts w:ascii="Times New Roman" w:hAnsi="Times New Roman" w:cs="Times New Roman"/>
+          <w:b/>
+          <w:bCs/>
+          <w:sz w:val="24"/>
+          <w:szCs w:val="24"/>
+        </w:rPr>
+        <w:tab/>
+        <w:t xml:space="preserve">Ethical Standards and Considerations </w:t>
+      </w:r>
+    </w:p>
+    <w:p>
+      <w:pPr>
+        <w:spacing w:before="146" w:line="480" w:lineRule="auto"/>
+        <w:ind w:left="284" w:right="283" w:firstLine="360"/>
+        <w:jc w:val="both"/>
+        <w:rPr>
+          <w:rPr>
+            <w:rFonts w:ascii="Times New Roman" w:hAnsi="Times New Roman" w:cs="Times New Roman"/>
+            <w:sz w:val="24"/>
+            <w:szCs w:val="24"/>
+          </w:rPr>
+        </w:rPr>
+      </w:pPr>
+      <w:r>
+        <w:rPr>
+          <w:rFonts w:ascii="Times New Roman" w:hAnsi="Times New Roman" w:cs="Times New Roman"/>
+          <w:sz w:val="24"/>
+          <w:szCs w:val="24"/>
+        </w:rPr>
+        <w:t>The researchers observed appropriate ethical standards throughout the planning, development, implementation, testing, and evaluation of the proposed system. The researchers recognized their responsibility to protect the rights, privacy, confidentiality, and welfare of the individuals and organization involved in the study. All information gathered from the beneficiary, respondents, and other stakeholders was treated responsibly and was used only for purposes directly related to the development and evaluation of the proposed system.</w:t>
+      </w:r>
+    </w:p>
+    <w:p>
+      <w:pPr>
+        <w:spacing w:before="146" w:line="480" w:lineRule="auto"/>
+        <w:ind w:left="284" w:right="283" w:firstLine="360"/>
+        <w:jc w:val="both"/>
+        <w:rPr>
+          <w:rPr>
+            <w:rFonts w:ascii="Times New Roman" w:hAnsi="Times New Roman" w:cs="Times New Roman"/>
+            <w:sz w:val="24"/>
+            <w:szCs w:val="24"/>
+          </w:rPr>
+        </w:rPr>
+      </w:pPr>
+      <w:r>
+        <w:rPr>
+          <w:rFonts w:ascii="Times New Roman" w:hAnsi="Times New Roman" w:cs="Times New Roman"/>
+          <w:sz w:val="24"/>
+          <w:szCs w:val="24"/>
+        </w:rPr>
+        <w:t>In addition, the researchers adhered to the following ethical standards and considerations throughout the conduct of the study:</w:t>
+      </w:r>
+    </w:p>
+    <w:p>
+      <w:pPr>
+        <w:spacing w:before="146" w:line="480" w:lineRule="auto"/>
+        <w:ind w:left="284" w:right="283" w:firstLine="360"/>
+        <w:jc w:val="both"/>
+        <w:rPr>
+          <w:rPr>
+            <w:rFonts w:ascii="Times New Roman" w:hAnsi="Times New Roman" w:cs="Times New Roman"/>
+            <w:sz w:val="24"/>
+            <w:szCs w:val="24"/>
+          </w:rPr>
+        </w:rPr>
+      </w:pPr>
+      <w:r>
+        <w:rPr>
+          <w:rFonts w:ascii="Times New Roman" w:hAnsi="Times New Roman" w:cs="Times New Roman"/>
+          <w:b/>
+          <w:bCs/>
+          <w:sz w:val="24"/>
+          <w:szCs w:val="24"/>
+        </w:rPr>
+        <w:t>Informed Consent and Voluntary Participation. </w:t>
+      </w:r>
+      <w:r>
+        <w:rPr>
+          <w:rFonts w:ascii="Times New Roman" w:hAnsi="Times New Roman" w:cs="Times New Roman"/>
+          <w:sz w:val="24"/>
+          <w:szCs w:val="24"/>
+        </w:rPr>
+        <w:t xml:space="preserve">The water service personnel who participated in the interviews, the questionnaire survey, and the system evaluation were informed of the purpose and the procedures of the study. Participation was strictly voluntary, and the participants were given the option to withdraw at any time without any consequence to them.</w:t>
+      </w:r>
+    </w:p>
+    <w:p>
+      <w:pPr>
+        <w:spacing w:before="146" w:line="480" w:lineRule="auto"/>
+        <w:ind w:left="284" w:right="283" w:firstLine="360"/>
+        <w:jc w:val="both"/>
+        <w:rPr>
+          <w:rPr>
+            <w:rFonts w:ascii="Times New Roman" w:hAnsi="Times New Roman" w:cs="Times New Roman"/>
+            <w:sz w:val="24"/>
+            <w:szCs w:val="24"/>
+          </w:rPr>
+        </w:rPr>
+      </w:pPr>
+      <w:r>
+        <w:rPr>
+          <w:rFonts w:ascii="Times New Roman" w:hAnsi="Times New Roman" w:cs="Times New Roman"/>
+          <w:b/>
+          <w:bCs/>
+          <w:sz w:val="24"/>
+          <w:szCs w:val="24"/>
+        </w:rPr>
+        <w:t>Privacy and Confidentiality. </w:t>
+      </w:r>
+      <w:r>
+        <w:rPr>
+          <w:rFonts w:ascii="Times New Roman" w:hAnsi="Times New Roman" w:cs="Times New Roman"/>
+          <w:sz w:val="24"/>
+          <w:szCs w:val="24"/>
+        </w:rPr>
+        <w:t xml:space="preserve">The personal information of the participants and the complaint records submitted to the system were treated as confidential. Access to the data is limited to authorized users through the role-based access control (RBAC) mechanism, and the data were used only for purposes directly related to the study.</w:t>
+      </w:r>
+    </w:p>
+    <w:p>
+      <w:pPr>
+        <w:spacing w:before="146" w:line="480" w:lineRule="auto"/>
+        <w:ind w:left="284" w:right="283" w:firstLine="360"/>
+        <w:jc w:val="both"/>
+        <w:rPr>
+          <w:rPr>
+            <w:rFonts w:ascii="Times New Roman" w:hAnsi="Times New Roman" w:cs="Times New Roman"/>
+            <w:sz w:val="24"/>
+            <w:szCs w:val="24"/>
+          </w:rPr>
+        </w:rPr>
+      </w:pPr>
+      <w:r>
+        <w:rPr>
+          <w:rFonts w:ascii="Times New Roman" w:hAnsi="Times New Roman" w:cs="Times New Roman"/>
+          <w:b/>
+          <w:bCs/>
+          <w:sz w:val="24"/>
+          <w:szCs w:val="24"/>
+        </w:rPr>
+        <w:t>Data Privacy Act Compliance. </w:t>
+      </w:r>
+      <w:r>
+        <w:rPr>
+          <w:rFonts w:ascii="Times New Roman" w:hAnsi="Times New Roman" w:cs="Times New Roman"/>
+          <w:sz w:val="24"/>
+          <w:szCs w:val="24"/>
+        </w:rPr>
+        <w:t xml:space="preserve">The collection, processing, and storage of personal and complaint data comply with the provisions of the Data Privacy Act of 2012 (Republic Act No. 10173). The data are stored securely, retained only for the duration of the study, and disposed of properly after the completion of the research.</w:t>
+      </w:r>
+    </w:p>
+    <w:p>
+      <w:pPr>
+        <w:spacing w:before="146" w:line="480" w:lineRule="auto"/>
+        <w:ind w:left="284" w:right="283" w:firstLine="360"/>
+        <w:jc w:val="both"/>
+        <w:rPr>
+          <w:rPr>
+            <w:rFonts w:ascii="Times New Roman" w:hAnsi="Times New Roman" w:cs="Times New Roman"/>
+            <w:sz w:val="24"/>
+            <w:szCs w:val="24"/>
+          </w:rPr>
+        </w:rPr>
+      </w:pPr>
+      <w:r>
+        <w:rPr>
+          <w:rFonts w:ascii="Times New Roman" w:hAnsi="Times New Roman" w:cs="Times New Roman"/>
+          <w:b/>
+          <w:bCs/>
+          <w:sz w:val="24"/>
+          <w:szCs w:val="24"/>
+        </w:rPr>
+        <w:t>Non-Maleficence. </w:t>
+      </w:r>
+      <w:r>
+        <w:rPr>
+          <w:rFonts w:ascii="Times New Roman" w:hAnsi="Times New Roman" w:cs="Times New Roman"/>
+          <w:sz w:val="24"/>
+          <w:szCs w:val="24"/>
+        </w:rPr>
+        <w:t xml:space="preserve">The data gathering and system testing activities were designed to avoid any harm or disruption to the operations of the water service provider. No sensitive information belonging to third parties was exposed at any point during the study.</w:t>
+      </w:r>
+    </w:p>
+    <w:p>
+      <w:pPr>
+        <w:spacing w:before="146" w:line="480" w:lineRule="auto"/>
+        <w:ind w:left="284" w:right="283" w:firstLine="360"/>
+        <w:jc w:val="both"/>
+        <w:rPr>
+          <w:rPr>
+            <w:rFonts w:ascii="Times New Roman" w:hAnsi="Times New Roman" w:cs="Times New Roman"/>
+            <w:sz w:val="24"/>
+            <w:szCs w:val="24"/>
+          </w:rPr>
+        </w:rPr>
+      </w:pPr>
+      <w:r>
+        <w:rPr>
+          <w:rFonts w:ascii="Times New Roman" w:hAnsi="Times New Roman" w:cs="Times New Roman"/>
+          <w:b/>
+          <w:bCs/>
+          <w:sz w:val="24"/>
+          <w:szCs w:val="24"/>
+        </w:rPr>
+        <w:t>Integrity of Findings. </w:t>
+      </w:r>
+      <w:r>
+        <w:rPr>
+          <w:rFonts w:ascii="Times New Roman" w:hAnsi="Times New Roman" w:cs="Times New Roman"/>
+          <w:sz w:val="24"/>
+          <w:szCs w:val="24"/>
+        </w:rPr>
+        <w:t xml:space="preserve">The researchers reported the gathered data and the evaluation results truthfully. No data were fabricated, falsified, or manipulated, and any errors encountered during testing were documented accurately.</w:t>
+      </w:r>
+    </w:p>
+    <w:p>
+      <w:pPr>
+        <w:spacing w:before="146" w:line="480" w:lineRule="auto"/>
+        <w:ind w:left="284" w:right="283" w:firstLine="360"/>
+        <w:jc w:val="both"/>
+        <w:rPr>
+          <w:rPr>
+            <w:rFonts w:ascii="Times New Roman" w:hAnsi="Times New Roman" w:cs="Times New Roman"/>
+            <w:sz w:val="24"/>
+            <w:szCs w:val="24"/>
+          </w:rPr>
+        </w:rPr>
+      </w:pPr>
+      <w:r>
+        <w:rPr>
+          <w:rFonts w:ascii="Times New Roman" w:hAnsi="Times New Roman" w:cs="Times New Roman"/>
+          <w:b/>
+          <w:bCs/>
+          <w:sz w:val="24"/>
+          <w:szCs w:val="24"/>
+        </w:rPr>
+        <w:t>Acknowledgement of Sources. </w:t>
+      </w:r>
+      <w:r>
+        <w:rPr>
+          <w:rFonts w:ascii="Times New Roman" w:hAnsi="Times New Roman" w:cs="Times New Roman"/>
+          <w:sz w:val="24"/>
+          <w:szCs w:val="24"/>
+        </w:rPr>
+        <w:t xml:space="preserve">All literature, tools, frameworks, and materials used in the study and in the development of the system are properly cited and acknowledged. The researchers do not claim ownership of any previously published or authored content.</w:t>
       </w:r>
     </w:p>
     <w:sectPr>

</xml_diff>